<commit_message>
Improve revision assessments, analytics and teacher-controlled speaking pairs
</commit_message>
<xml_diff>
--- a/frontend/templates/Revision-Unit-7-Group-213-With-Reading-Preview.docx
+++ b/frontend/templates/Revision-Unit-7-Group-213-With-Reading-Preview.docx
@@ -53,7 +53,7 @@
     </w:p>
     <w:p>
       <w:r>
-        <w:t>1. Elena discovered that her great-great-grandfather moved abroad in 1820. Which statement describes the discovery accurately?</w:t>
+        <w:t>1. Which sentence uses “ancestor” correctly in meaning and usage?</w:t>
       </w:r>
     </w:p>
     <w:p>
@@ -61,7 +61,7 @@
         <w:spacing w:after="20"/>
       </w:pPr>
       <w:r>
-        <w:t>A. She discovered her present-day citizenship.</w:t>
+        <w:t>A. Every person with her nationality is automatically her ancestor.</w:t>
       </w:r>
     </w:p>
     <w:p>
@@ -69,7 +69,7 @@
         <w:spacing w:after="20"/>
       </w:pPr>
       <w:r>
-        <w:t>B. She discovered who would inherit her possessions.</w:t>
+        <w:t>B. Every neighbour from her childhood is automatically her ancestor.</w:t>
       </w:r>
     </w:p>
     <w:p>
@@ -77,7 +77,7 @@
         <w:spacing w:after="20"/>
       </w:pPr>
       <w:r>
-        <w:t>C. She learned where one of her descendants had lived.</w:t>
+        <w:t>C. Her future great-grandchild is one of her ancestors.</w:t>
       </w:r>
     </w:p>
     <w:p>
@@ -85,7 +85,7 @@
         <w:spacing w:after="20"/>
       </w:pPr>
       <w:r>
-        <w:t>D. She learned where one of her ancestors had lived.</w:t>
+        <w:t>D. Her great-great-grandfather was one of her ancestors.</w:t>
       </w:r>
     </w:p>
     <w:p>
@@ -93,7 +93,7 @@
         <w:spacing w:after="20"/>
       </w:pPr>
       <w:r>
-        <w:t>E. She identified the parents who had adopted her.</w:t>
+        <w:t>E. A person who joins the company after her is necessarily her ancestor.</w:t>
       </w:r>
     </w:p>
     <w:p>
@@ -116,7 +116,7 @@
         <w:spacing w:after="20"/>
       </w:pPr>
       <w:r>
-        <w:t>B. nationality</w:t>
+        <w:t>B. heritage</w:t>
       </w:r>
     </w:p>
     <w:p>
@@ -124,7 +124,7 @@
         <w:spacing w:after="20"/>
       </w:pPr>
       <w:r>
-        <w:t>C. identity</w:t>
+        <w:t>C. significance</w:t>
       </w:r>
     </w:p>
     <w:p>
@@ -132,7 +132,7 @@
         <w:spacing w:after="20"/>
       </w:pPr>
       <w:r>
-        <w:t>D. heritage</w:t>
+        <w:t>D. genealogy</w:t>
       </w:r>
     </w:p>
     <w:p>
@@ -155,7 +155,7 @@
         <w:spacing w:after="20"/>
       </w:pPr>
       <w:r>
-        <w:t>A. anthropology</w:t>
+        <w:t>A. ethnicity</w:t>
       </w:r>
     </w:p>
     <w:p>
@@ -163,7 +163,7 @@
         <w:spacing w:after="20"/>
       </w:pPr>
       <w:r>
-        <w:t>B. genetics</w:t>
+        <w:t>B. ancestry</w:t>
       </w:r>
     </w:p>
     <w:p>
@@ -171,7 +171,7 @@
         <w:spacing w:after="20"/>
       </w:pPr>
       <w:r>
-        <w:t>C. archaeology</w:t>
+        <w:t>C. significance</w:t>
       </w:r>
     </w:p>
     <w:p>
@@ -187,7 +187,7 @@
         <w:spacing w:after="20"/>
       </w:pPr>
       <w:r>
-        <w:t>E. ethnography</w:t>
+        <w:t>E. heritage</w:t>
       </w:r>
     </w:p>
     <w:p>
@@ -202,7 +202,7 @@
         <w:spacing w:after="20"/>
       </w:pPr>
       <w:r>
-        <w:t>A. citizenship</w:t>
+        <w:t>A. significance</w:t>
       </w:r>
     </w:p>
     <w:p>
@@ -210,7 +210,7 @@
         <w:spacing w:after="20"/>
       </w:pPr>
       <w:r>
-        <w:t>B. nationality</w:t>
+        <w:t>B. friction</w:t>
       </w:r>
     </w:p>
     <w:p>
@@ -226,7 +226,7 @@
         <w:spacing w:after="20"/>
       </w:pPr>
       <w:r>
-        <w:t>D. residence</w:t>
+        <w:t>D. genealogy</w:t>
       </w:r>
     </w:p>
     <w:p>
@@ -234,7 +234,7 @@
         <w:spacing w:after="20"/>
       </w:pPr>
       <w:r>
-        <w:t>E. ancestry</w:t>
+        <w:t>E. heritage</w:t>
       </w:r>
     </w:p>
     <w:p>
@@ -257,7 +257,7 @@
         <w:spacing w:after="20"/>
       </w:pPr>
       <w:r>
-        <w:t>B. nationality</w:t>
+        <w:t>B. genealogy</w:t>
       </w:r>
     </w:p>
     <w:p>
@@ -265,7 +265,7 @@
         <w:spacing w:after="20"/>
       </w:pPr>
       <w:r>
-        <w:t>C. ancestry</w:t>
+        <w:t>C. friction</w:t>
       </w:r>
     </w:p>
     <w:p>
@@ -273,7 +273,7 @@
         <w:spacing w:after="20"/>
       </w:pPr>
       <w:r>
-        <w:t>D. genealogy</w:t>
+        <w:t>D. ancestry</w:t>
       </w:r>
     </w:p>
     <w:p>
@@ -286,9 +286,7 @@
     </w:p>
     <w:p>
       <w:r>
-        <w:t>6. Choose the expression that best fits the meaning and usage in this context.</w:t>
-        <w:br/>
-        <w:t>After the court completed the legal process, the couple became the child’s ___ parents, with permanent parental rights and responsibilities.</w:t>
+        <w:t>6. Which sentence uses “adoptive” correctly in meaning and usage?</w:t>
       </w:r>
     </w:p>
     <w:p>
@@ -296,7 +294,7 @@
         <w:spacing w:after="20"/>
       </w:pPr>
       <w:r>
-        <w:t>A. adoptive</w:t>
+        <w:t>A. The court made them the child’s adoptive parents, with permanent parental rights.</w:t>
       </w:r>
     </w:p>
     <w:p>
@@ -304,7 +302,7 @@
         <w:spacing w:after="20"/>
       </w:pPr>
       <w:r>
-        <w:t>B. surrogate</w:t>
+        <w:t>B. All biological parents are adoptive parents simply because they raise their children.</w:t>
       </w:r>
     </w:p>
     <w:p>
@@ -312,7 +310,7 @@
         <w:spacing w:after="20"/>
       </w:pPr>
       <w:r>
-        <w:t>C. foster</w:t>
+        <w:t>C. A family friend becomes an adoptive parent by visiting the child.</w:t>
       </w:r>
     </w:p>
     <w:p>
@@ -320,7 +318,7 @@
         <w:spacing w:after="20"/>
       </w:pPr>
       <w:r>
-        <w:t>D. biological</w:t>
+        <w:t>D. Any teacher becomes an adoptive parent by teaching a child.</w:t>
       </w:r>
     </w:p>
     <w:p>
@@ -328,14 +326,12 @@
         <w:spacing w:after="20"/>
       </w:pPr>
       <w:r>
-        <w:t>E. prospective</w:t>
+        <w:t>E. The court called them adoptive parents solely because they cared for the child temporarily.</w:t>
       </w:r>
     </w:p>
     <w:p>
       <w:r>
-        <w:t>7. Choose the expression that best fits the meaning and usage in this context.</w:t>
-        <w:br/>
-        <w:t>When the speaker described feeling caught between two cultures, many listeners recognised their own experience. Her account struck a ___ with them.</w:t>
+        <w:t>7. Which expression is natural in English?</w:t>
       </w:r>
     </w:p>
     <w:p>
@@ -343,7 +339,7 @@
         <w:spacing w:after="20"/>
       </w:pPr>
       <w:r>
-        <w:t>A. rhythm</w:t>
+        <w:t>A. struck a chord at</w:t>
       </w:r>
     </w:p>
     <w:p>
@@ -351,7 +347,7 @@
         <w:spacing w:after="20"/>
       </w:pPr>
       <w:r>
-        <w:t>B. chord</w:t>
+        <w:t>B. struck a chord with</w:t>
       </w:r>
     </w:p>
     <w:p>
@@ -359,7 +355,7 @@
         <w:spacing w:after="20"/>
       </w:pPr>
       <w:r>
-        <w:t>C. note</w:t>
+        <w:t>C. struck a chord to</w:t>
       </w:r>
     </w:p>
     <w:p>
@@ -367,7 +363,7 @@
         <w:spacing w:after="20"/>
       </w:pPr>
       <w:r>
-        <w:t>D. harmony</w:t>
+        <w:t>D. struck a chord on</w:t>
       </w:r>
     </w:p>
     <w:p>
@@ -375,14 +371,12 @@
         <w:spacing w:after="20"/>
       </w:pPr>
       <w:r>
-        <w:t>E. tone</w:t>
+        <w:t>E. struck a chord for</w:t>
       </w:r>
     </w:p>
     <w:p>
       <w:r>
-        <w:t>8. Choose the expression that best fits the meaning and usage in this context.</w:t>
-        <w:br/>
-        <w:t>At the ceremony, the younger members paid ___ to the elders who had preserved the language and taught it to others.</w:t>
+        <w:t>8. Which expression is natural in English?</w:t>
       </w:r>
     </w:p>
     <w:p>
@@ -390,7 +384,7 @@
         <w:spacing w:after="20"/>
       </w:pPr>
       <w:r>
-        <w:t>A. respect</w:t>
+        <w:t>A. paid tribute on</w:t>
       </w:r>
     </w:p>
     <w:p>
@@ -398,7 +392,7 @@
         <w:spacing w:after="20"/>
       </w:pPr>
       <w:r>
-        <w:t>B. honour</w:t>
+        <w:t>B. paid tribute of</w:t>
       </w:r>
     </w:p>
     <w:p>
@@ -406,7 +400,7 @@
         <w:spacing w:after="20"/>
       </w:pPr>
       <w:r>
-        <w:t>C. tribute</w:t>
+        <w:t>C. paid tribute to</w:t>
       </w:r>
     </w:p>
     <w:p>
@@ -414,7 +408,7 @@
         <w:spacing w:after="20"/>
       </w:pPr>
       <w:r>
-        <w:t>D. homage</w:t>
+        <w:t>D. paid tribute at</w:t>
       </w:r>
     </w:p>
     <w:p>
@@ -422,7 +416,7 @@
         <w:spacing w:after="20"/>
       </w:pPr>
       <w:r>
-        <w:t>E. attention</w:t>
+        <w:t>E. paid tribute with</w:t>
       </w:r>
     </w:p>
     <w:p>
@@ -440,7 +434,7 @@
     </w:p>
     <w:p>
       <w:r>
-        <w:t>9. Choose the correct completion: Not until the documents arrived ___ that the family story was inaccurate.</w:t>
+        <w:t>9. Complete the whole gap using SEE: Never ___ such a detailed family tree. (experience up to now)</w:t>
       </w:r>
     </w:p>
     <w:p>
@@ -448,7 +442,7 @@
         <w:spacing w:after="20"/>
       </w:pPr>
       <w:r>
-        <w:t>A. she did realise</w:t>
+        <w:t>A. did I seen</w:t>
       </w:r>
     </w:p>
     <w:p>
@@ -456,7 +450,7 @@
         <w:spacing w:after="20"/>
       </w:pPr>
       <w:r>
-        <w:t>B. did she realised</w:t>
+        <w:t>B. had I see</w:t>
       </w:r>
     </w:p>
     <w:p>
@@ -464,7 +458,7 @@
         <w:spacing w:after="20"/>
       </w:pPr>
       <w:r>
-        <w:t>C. had she realise</w:t>
+        <w:t>C. have I saw</w:t>
       </w:r>
     </w:p>
     <w:p>
@@ -472,7 +466,7 @@
         <w:spacing w:after="20"/>
       </w:pPr>
       <w:r>
-        <w:t>D. did she realise</w:t>
+        <w:t>D. have I seen</w:t>
       </w:r>
     </w:p>
     <w:p>
@@ -480,12 +474,12 @@
         <w:spacing w:after="20"/>
       </w:pPr>
       <w:r>
-        <w:t>E. she realised</w:t>
+        <w:t>E. I have seen</w:t>
       </w:r>
     </w:p>
     <w:p>
       <w:r>
-        <w:t>10. Choose the correct completion: Never before ___ so many details about his ancestry.</w:t>
+        <w:t>10. Complete the whole gap using REALISE: Only after the ceremony ___ its significance. (past simple)</w:t>
       </w:r>
     </w:p>
     <w:p>
@@ -493,7 +487,7 @@
         <w:spacing w:after="20"/>
       </w:pPr>
       <w:r>
-        <w:t>A. did he discovered</w:t>
+        <w:t>A. did we realised</w:t>
       </w:r>
     </w:p>
     <w:p>
@@ -501,7 +495,7 @@
         <w:spacing w:after="20"/>
       </w:pPr>
       <w:r>
-        <w:t>B. he had discovered</w:t>
+        <w:t>B. we realised</w:t>
       </w:r>
     </w:p>
     <w:p>
@@ -509,7 +503,7 @@
         <w:spacing w:after="20"/>
       </w:pPr>
       <w:r>
-        <w:t>C. had he discovered</w:t>
+        <w:t>C. did we realise</w:t>
       </w:r>
     </w:p>
     <w:p>
@@ -517,7 +511,7 @@
         <w:spacing w:after="20"/>
       </w:pPr>
       <w:r>
-        <w:t>D. had discovered he</w:t>
+        <w:t>D. were we realise</w:t>
       </w:r>
     </w:p>
     <w:p>
@@ -525,12 +519,12 @@
         <w:spacing w:after="20"/>
       </w:pPr>
       <w:r>
-        <w:t>E. he did discover</w:t>
+        <w:t>E. had we realise</w:t>
       </w:r>
     </w:p>
     <w:p>
       <w:r>
-        <w:t>11. Choose the correctly inverted sentence.</w:t>
+        <w:t>11. Complete the whole gap using DISCOVER: Not until the records arrived ___ the missing branch of her family tree. (past simple)</w:t>
       </w:r>
     </w:p>
     <w:p>
@@ -538,7 +532,7 @@
         <w:spacing w:after="20"/>
       </w:pPr>
       <w:r>
-        <w:t>A. Only after the ceremony we understood its significance.</w:t>
+        <w:t>A. she discovered</w:t>
       </w:r>
     </w:p>
     <w:p>
@@ -546,7 +540,7 @@
         <w:spacing w:after="20"/>
       </w:pPr>
       <w:r>
-        <w:t>B. Only after the ceremony did we understood its significance.</w:t>
+        <w:t>B. did she discovered</w:t>
       </w:r>
     </w:p>
     <w:p>
@@ -554,7 +548,7 @@
         <w:spacing w:after="20"/>
       </w:pPr>
       <w:r>
-        <w:t>C. Only after the ceremony understood we its significance.</w:t>
+        <w:t>C. was she discovered</w:t>
       </w:r>
     </w:p>
     <w:p>
@@ -562,7 +556,7 @@
         <w:spacing w:after="20"/>
       </w:pPr>
       <w:r>
-        <w:t>D. Only after the ceremony had we understand its significance.</w:t>
+        <w:t>D. had she discover</w:t>
       </w:r>
     </w:p>
     <w:p>
@@ -570,12 +564,12 @@
         <w:spacing w:after="20"/>
       </w:pPr>
       <w:r>
-        <w:t>E. Only after the ceremony did we understand its significance.</w:t>
+        <w:t>E. did she discover</w:t>
       </w:r>
     </w:p>
     <w:p>
       <w:r>
-        <w:t>12. Choose the correct completion: Not only ___ the old custom, but it also made it accessible to newcomers.</w:t>
+        <w:t>12. Complete the whole gap using SPEAK: Rarely ___ about his childhood nowadays. (present simple)</w:t>
       </w:r>
     </w:p>
     <w:p>
@@ -583,7 +577,7 @@
         <w:spacing w:after="20"/>
       </w:pPr>
       <w:r>
-        <w:t>A. had the festival preserve</w:t>
+        <w:t>A. is he speak</w:t>
       </w:r>
     </w:p>
     <w:p>
@@ -591,7 +585,7 @@
         <w:spacing w:after="20"/>
       </w:pPr>
       <w:r>
-        <w:t>B. did the festival preserve</w:t>
+        <w:t>B. does he speak</w:t>
       </w:r>
     </w:p>
     <w:p>
@@ -599,7 +593,7 @@
         <w:spacing w:after="20"/>
       </w:pPr>
       <w:r>
-        <w:t>C. the festival preserved</w:t>
+        <w:t>C. he speaks</w:t>
       </w:r>
     </w:p>
     <w:p>
@@ -607,7 +601,7 @@
         <w:spacing w:after="20"/>
       </w:pPr>
       <w:r>
-        <w:t>D. did the festival preserved</w:t>
+        <w:t>D. does he speaks</w:t>
       </w:r>
     </w:p>
     <w:p>
@@ -615,12 +609,12 @@
         <w:spacing w:after="20"/>
       </w:pPr>
       <w:r>
-        <w:t>E. preserved the festival</w:t>
+        <w:t>E. did he spoke</w:t>
       </w:r>
     </w:p>
     <w:p>
       <w:r>
-        <w:t>13. Choose the correct completion: Little ___ at the time how important those records would become.</w:t>
+        <w:t>13. Complete the whole gap using BE: Under no circumstances ___ allowed to share the records. (present simple)</w:t>
       </w:r>
     </w:p>
     <w:p>
@@ -628,7 +622,7 @@
         <w:spacing w:after="20"/>
       </w:pPr>
       <w:r>
-        <w:t>A. they did knew</w:t>
+        <w:t>A. does you be</w:t>
       </w:r>
     </w:p>
     <w:p>
@@ -636,7 +630,52 @@
         <w:spacing w:after="20"/>
       </w:pPr>
       <w:r>
-        <w:t>B. had they knew</w:t>
+        <w:t>B. do you be</w:t>
+      </w:r>
+    </w:p>
+    <w:p>
+      <w:pPr>
+        <w:spacing w:after="20"/>
+      </w:pPr>
+      <w:r>
+        <w:t>C. are you be</w:t>
+      </w:r>
+    </w:p>
+    <w:p>
+      <w:pPr>
+        <w:spacing w:after="20"/>
+      </w:pPr>
+      <w:r>
+        <w:t>D. are you</w:t>
+      </w:r>
+    </w:p>
+    <w:p>
+      <w:pPr>
+        <w:spacing w:after="20"/>
+      </w:pPr>
+      <w:r>
+        <w:t>E. you are</w:t>
+      </w:r>
+    </w:p>
+    <w:p>
+      <w:r>
+        <w:t>14. Complete the whole gap using KNOW: Little ___ at the time how much would change. (past simple)</w:t>
+      </w:r>
+    </w:p>
+    <w:p>
+      <w:pPr>
+        <w:spacing w:after="20"/>
+      </w:pPr>
+      <w:r>
+        <w:t>A. did they know</w:t>
+      </w:r>
+    </w:p>
+    <w:p>
+      <w:pPr>
+        <w:spacing w:after="20"/>
+      </w:pPr>
+      <w:r>
+        <w:t>B. they knew</w:t>
       </w:r>
     </w:p>
     <w:p>
@@ -652,7 +691,7 @@
         <w:spacing w:after="20"/>
       </w:pPr>
       <w:r>
-        <w:t>D. did they know</w:t>
+        <w:t>D. were they know</w:t>
       </w:r>
     </w:p>
     <w:p>
@@ -660,12 +699,12 @@
         <w:spacing w:after="20"/>
       </w:pPr>
       <w:r>
-        <w:t>E. they knew</w:t>
+        <w:t>E. had they know</w:t>
       </w:r>
     </w:p>
     <w:p>
       <w:r>
-        <w:t>14. Choose the correct completion: Under no circumstances ___ without explicit permission.</w:t>
+        <w:t>15. Keep the meaning and present simple: An old church stands at the end of the road. At the end of the road ___.</w:t>
       </w:r>
     </w:p>
     <w:p>
@@ -673,7 +712,7 @@
         <w:spacing w:after="20"/>
       </w:pPr>
       <w:r>
-        <w:t>A. should the records be shared</w:t>
+        <w:t>A. stand an old church</w:t>
       </w:r>
     </w:p>
     <w:p>
@@ -681,7 +720,7 @@
         <w:spacing w:after="20"/>
       </w:pPr>
       <w:r>
-        <w:t>B. the records should be shared</w:t>
+        <w:t>B. stands an old church</w:t>
       </w:r>
     </w:p>
     <w:p>
@@ -689,7 +728,7 @@
         <w:spacing w:after="20"/>
       </w:pPr>
       <w:r>
-        <w:t>C. should be the records shared</w:t>
+        <w:t>C. standing an old church</w:t>
       </w:r>
     </w:p>
     <w:p>
@@ -697,7 +736,7 @@
         <w:spacing w:after="20"/>
       </w:pPr>
       <w:r>
-        <w:t>D. the records should share</w:t>
+        <w:t>D. an old church stand</w:t>
       </w:r>
     </w:p>
     <w:p>
@@ -705,57 +744,12 @@
         <w:spacing w:after="20"/>
       </w:pPr>
       <w:r>
-        <w:t>E. should the records shared</w:t>
+        <w:t>E. did stands an old church</w:t>
       </w:r>
     </w:p>
     <w:p>
       <w:r>
-        <w:t>15. Use full subject–verb inversion after the fronted place phrase: At the far end of the village ___.</w:t>
-      </w:r>
-    </w:p>
-    <w:p>
-      <w:pPr>
-        <w:spacing w:after="20"/>
-      </w:pPr>
-      <w:r>
-        <w:t>A. an ancient shrine stood</w:t>
-      </w:r>
-    </w:p>
-    <w:p>
-      <w:pPr>
-        <w:spacing w:after="20"/>
-      </w:pPr>
-      <w:r>
-        <w:t>B. stood an ancient shrine</w:t>
-      </w:r>
-    </w:p>
-    <w:p>
-      <w:pPr>
-        <w:spacing w:after="20"/>
-      </w:pPr>
-      <w:r>
-        <w:t>C. an ancient shrine did stood</w:t>
-      </w:r>
-    </w:p>
-    <w:p>
-      <w:pPr>
-        <w:spacing w:after="20"/>
-      </w:pPr>
-      <w:r>
-        <w:t>D. stood it an ancient shrine</w:t>
-      </w:r>
-    </w:p>
-    <w:p>
-      <w:pPr>
-        <w:spacing w:after="20"/>
-      </w:pPr>
-      <w:r>
-        <w:t>E. did stood an ancient shrine</w:t>
-      </w:r>
-    </w:p>
-    <w:p>
-      <w:r>
-        <w:t>16. Choose the correct completion with a pronoun subject: Into the courtyard ___.</w:t>
+        <w:t>16. Keep the meaning and pronoun: She ran into the courtyard. Into the courtyard ___.</w:t>
       </w:r>
     </w:p>
     <w:p>
@@ -779,7 +773,7 @@
         <w:spacing w:after="20"/>
       </w:pPr>
       <w:r>
-        <w:t>C. had ran she</w:t>
+        <w:t>C. she run</w:t>
       </w:r>
     </w:p>
     <w:p>
@@ -787,7 +781,7 @@
         <w:spacing w:after="20"/>
       </w:pPr>
       <w:r>
-        <w:t>D. ran did she</w:t>
+        <w:t>D. had she ran</w:t>
       </w:r>
     </w:p>
     <w:p>
@@ -813,9 +807,7 @@
     </w:p>
     <w:p>
       <w:r>
-        <w:t>17. Choose the expression that best fits the meaning and usage in this context.</w:t>
-        <w:br/>
-        <w:t>Leo refuses to open an umbrella indoors because he believes it brings bad luck. Although he knows there is no evidence, he remains ___.</w:t>
+        <w:t>17. Which sentence uses “superstitious” correctly in meaning and usage?</w:t>
       </w:r>
     </w:p>
     <w:p>
@@ -823,7 +815,7 @@
         <w:spacing w:after="20"/>
       </w:pPr>
       <w:r>
-        <w:t>A. superstitious</w:t>
+        <w:t>A. Avoiding certain dates because they supposedly bring bad luck is superstitious behaviour.</w:t>
       </w:r>
     </w:p>
     <w:p>
@@ -831,7 +823,7 @@
         <w:spacing w:after="20"/>
       </w:pPr>
       <w:r>
-        <w:t>B. religious</w:t>
+        <w:t>B. Checking clinical evidence before treatment is necessarily superstitious behaviour.</w:t>
       </w:r>
     </w:p>
     <w:p>
@@ -839,7 +831,7 @@
         <w:spacing w:after="20"/>
       </w:pPr>
       <w:r>
-        <w:t>C. cautious</w:t>
+        <w:t>C. Checking the weather forecast before sailing is necessarily superstitious behaviour.</w:t>
       </w:r>
     </w:p>
     <w:p>
@@ -847,7 +839,7 @@
         <w:spacing w:after="20"/>
       </w:pPr>
       <w:r>
-        <w:t>D. sceptical</w:t>
+        <w:t>D. Checking whether a website is secure is necessarily superstitious behaviour.</w:t>
       </w:r>
     </w:p>
     <w:p>
@@ -855,12 +847,12 @@
         <w:spacing w:after="20"/>
       </w:pPr>
       <w:r>
-        <w:t>E. traditional</w:t>
+        <w:t>E. Using birth certificates to verify a date is necessarily superstitious behaviour.</w:t>
       </w:r>
     </w:p>
     <w:p>
       <w:r>
-        <w:t>18. Which sentence uses nutmeg accurately?</w:t>
+        <w:t>18. Which sentence uses “nutmeg” correctly in meaning and usage?</w:t>
       </w:r>
     </w:p>
     <w:p>
@@ -868,7 +860,7 @@
         <w:spacing w:after="20"/>
       </w:pPr>
       <w:r>
-        <w:t>A. She poured a glass of nutmeg over the salad.</w:t>
+        <w:t>A. She drank a glass of nutmeg as her main beverage.</w:t>
       </w:r>
     </w:p>
     <w:p>
@@ -876,7 +868,7 @@
         <w:spacing w:after="20"/>
       </w:pPr>
       <w:r>
-        <w:t>B. She wore a nutmeg to protect her hands.</w:t>
+        <w:t>B. She booked a nutmeg to record her family history.</w:t>
       </w:r>
     </w:p>
     <w:p>
@@ -884,7 +876,7 @@
         <w:spacing w:after="20"/>
       </w:pPr>
       <w:r>
-        <w:t>C. She grated a little nutmeg into the warm milk.</w:t>
+        <w:t>C. She grated a little nutmeg into the milk to add flavour.</w:t>
       </w:r>
     </w:p>
     <w:p>
@@ -892,7 +884,7 @@
         <w:spacing w:after="20"/>
       </w:pPr>
       <w:r>
-        <w:t>D. She used nutmeg to describe her family tree.</w:t>
+        <w:t>D. She wore a nutmeg on her wrist to tell the time.</w:t>
       </w:r>
     </w:p>
     <w:p>
@@ -900,14 +892,12 @@
         <w:spacing w:after="20"/>
       </w:pPr>
       <w:r>
-        <w:t>E. She booked a nutmeg to celebrate the festival.</w:t>
+        <w:t>E. She paid a nutmeg to borrow money for her flat.</w:t>
       </w:r>
     </w:p>
     <w:p>
       <w:r>
-        <w:t>19. Choose the expression that best fits the meaning and usage in this context.</w:t>
-        <w:br/>
-        <w:t>In our local tradition, celebrations continue until ___ on 6 January, when the visit of the Magi is commemorated.</w:t>
+        <w:t>19. Which sentence uses “Epiphany” correctly in meaning and usage?</w:t>
       </w:r>
     </w:p>
     <w:p>
@@ -915,7 +905,7 @@
         <w:spacing w:after="20"/>
       </w:pPr>
       <w:r>
-        <w:t>A. Easter</w:t>
+        <w:t>A. They marked Epiphany as a ceremony that legally adopts a child.</w:t>
       </w:r>
     </w:p>
     <w:p>
@@ -923,7 +913,7 @@
         <w:spacing w:after="20"/>
       </w:pPr>
       <w:r>
-        <w:t>B. Pentecost</w:t>
+        <w:t>B. They marked Epiphany as the celebration of the coming of the Holy Spirit at Pentecost.</w:t>
       </w:r>
     </w:p>
     <w:p>
@@ -931,7 +921,7 @@
         <w:spacing w:after="20"/>
       </w:pPr>
       <w:r>
-        <w:t>C. Christmas</w:t>
+        <w:t>C. They marked Epiphany as the beginning of Advent before Christmas.</w:t>
       </w:r>
     </w:p>
     <w:p>
@@ -939,7 +929,7 @@
         <w:spacing w:after="20"/>
       </w:pPr>
       <w:r>
-        <w:t>D. Advent</w:t>
+        <w:t>D. They marked Epiphany as the Christian celebration of the Resurrection.</w:t>
       </w:r>
     </w:p>
     <w:p>
@@ -947,14 +937,12 @@
         <w:spacing w:after="20"/>
       </w:pPr>
       <w:r>
-        <w:t>E. Epiphany</w:t>
+        <w:t>E. They marked Epiphany on 6 January with a celebration of the visit of the Magi.</w:t>
       </w:r>
     </w:p>
     <w:p>
       <w:r>
-        <w:t>20. Choose the expression that best fits the meaning and usage in this context.</w:t>
-        <w:br/>
-        <w:t>The family gathered at the church for the child’s ___. During the ceremony, the priest poured water over the child’s head.</w:t>
+        <w:t>20. Which sentence uses “baptism” correctly in meaning and usage?</w:t>
       </w:r>
     </w:p>
     <w:p>
@@ -962,7 +950,7 @@
         <w:spacing w:after="20"/>
       </w:pPr>
       <w:r>
-        <w:t>A. communion</w:t>
+        <w:t>A. The family attended a baptism that was solely the signing of a mortgage.</w:t>
       </w:r>
     </w:p>
     <w:p>
@@ -970,7 +958,7 @@
         <w:spacing w:after="20"/>
       </w:pPr>
       <w:r>
-        <w:t>B. baptism</w:t>
+        <w:t>B. The family attended the child’s baptism, during which the priest poured water over the child’s head.</w:t>
       </w:r>
     </w:p>
     <w:p>
@@ -978,7 +966,7 @@
         <w:spacing w:after="20"/>
       </w:pPr>
       <w:r>
-        <w:t>C. ordination</w:t>
+        <w:t>C. The family attended a baptism that was solely a legal adoption hearing.</w:t>
       </w:r>
     </w:p>
     <w:p>
@@ -986,7 +974,7 @@
         <w:spacing w:after="20"/>
       </w:pPr>
       <w:r>
-        <w:t>D. confirmation</w:t>
+        <w:t>D. The family attended a baptism that was solely a discussion of genetic test results.</w:t>
       </w:r>
     </w:p>
     <w:p>
@@ -994,7 +982,7 @@
         <w:spacing w:after="20"/>
       </w:pPr>
       <w:r>
-        <w:t>E. wedding</w:t>
+        <w:t>E. The family attended a baptism that was solely a workplace induction.</w:t>
       </w:r>
     </w:p>
     <w:p>

</xml_diff>

<commit_message>
Add visible voluntary research choice to all paper question sheets
</commit_message>
<xml_diff>
--- a/frontend/templates/Revision-Unit-7-Group-213-With-Reading-Preview.docx
+++ b/frontend/templates/Revision-Unit-7-Group-213-With-Reading-Preview.docx
@@ -2,6 +2,47 @@
 <file path=word/document.xml><?xml version="1.0" encoding="utf-8"?>
 <w:document xmlns:wpc="http://schemas.microsoft.com/office/word/2010/wordprocessingCanvas" xmlns:mo="http://schemas.microsoft.com/office/mac/office/2008/main" xmlns:mc="http://schemas.openxmlformats.org/markup-compatibility/2006" xmlns:mv="urn:schemas-microsoft-com:mac:vml" xmlns:o="urn:schemas-microsoft-com:office:office" xmlns:r="http://schemas.openxmlformats.org/officeDocument/2006/relationships" xmlns:m="http://schemas.openxmlformats.org/officeDocument/2006/math" xmlns:v="urn:schemas-microsoft-com:vml" xmlns:wp14="http://schemas.microsoft.com/office/word/2010/wordprocessingDrawing" xmlns:wp="http://schemas.openxmlformats.org/drawingml/2006/wordprocessingDrawing" xmlns:w10="urn:schemas-microsoft-com:office:word" xmlns:w="http://schemas.openxmlformats.org/wordprocessingml/2006/main" xmlns:w14="http://schemas.microsoft.com/office/word/2010/wordml" xmlns:wpg="http://schemas.microsoft.com/office/word/2010/wordprocessingGroup" xmlns:wpi="http://schemas.microsoft.com/office/word/2010/wordprocessingInk" xmlns:wne="http://schemas.microsoft.com/office/word/2006/wordml" xmlns:wps="http://schemas.microsoft.com/office/word/2010/wordprocessingShape" mc:Ignorable="w14 wp14">
   <w:body>
+    <w:p>
+      <w:r>
+        <w:rPr>
+          <w:b/>
+          <w:sz w:val="20"/>
+        </w:rPr>
+        <w:t>Research participation · choose ONE option before starting</w:t>
+      </w:r>
+    </w:p>
+    <w:p>
+      <w:r>
+        <w:rPr>
+          <w:sz w:val="20"/>
+        </w:rPr>
+        <w:t>Name: __________________________   Group: ______   Date: __________</w:t>
+      </w:r>
+    </w:p>
+    <w:p>
+      <w:r>
+        <w:rPr>
+          <w:sz w:val="20"/>
+        </w:rPr>
+        <w:t>Your answers, scores and essay may be analysed for vocabulary-learning research. Participation is voluntary. Taking the test without participating does not affect your grade. Your name is used for teacher assessment; research reporting will not identify you. You may ask your teacher to withdraw your research data before anonymisation.</w:t>
+      </w:r>
+    </w:p>
+    <w:p>
+      <w:r>
+        <w:rPr>
+          <w:sz w:val="20"/>
+        </w:rPr>
+        <w:t>[ ] I agree to participate in the research.</w:t>
+      </w:r>
+    </w:p>
+    <w:p>
+      <w:r>
+        <w:rPr>
+          <w:sz w:val="20"/>
+        </w:rPr>
+        <w:t>[ ] I want to take the test without participating in the research.</w:t>
+      </w:r>
+    </w:p>
     <w:p>
       <w:pPr>
         <w:pStyle w:val="Title"/>
@@ -40,7 +81,7 @@
     </w:p>
     <w:p>
       <w:r>
-        <w:t>For questions 1–20, choose ONE best answer and shade A, B, C, D or E on the separate ZipGrade answer sheet. Do not write MCQ answers on this question paper. Check the question numbers carefully. Fill in your name and group (Period). Select Version A if using that field. Write the essay on the separate double-sided essay sheet. Record your research participation choice on that sheet.</w:t>
+        <w:t>For questions 1–20, choose ONE best answer and shade A, B, C, D or E on the separate ZipGrade answer sheet. Do not write MCQ answers on this question paper. Check the question numbers carefully. Fill in your name and group (Period). Select Version A if using that field. Write the essay on the separate double-sided essay sheet. Mark your research participation choice before starting the test.</w:t>
       </w:r>
     </w:p>
     <w:p>
@@ -1000,7 +1041,7 @@
     </w:p>
     <w:p>
       <w:r>
-        <w:t>Write your essay on the separate essay sheet. Do not write on this question paper.</w:t>
+        <w:t>Write your essay on the separate essay sheet. Only the research participation box may be filled in on this question paper; use ZipGrade for answers 1–20.</w:t>
       </w:r>
     </w:p>
     <w:sectPr>

</xml_diff>

<commit_message>
Separate speaking roles, grade paired dialogues together and streamline paper pack
</commit_message>
<xml_diff>
--- a/frontend/templates/Revision-Unit-7-Group-213-With-Reading-Preview.docx
+++ b/frontend/templates/Revision-Unit-7-Group-213-With-Reading-Preview.docx
@@ -53,7 +53,7 @@
     </w:p>
     <w:p>
       <w:r>
-        <w:t>Read this short text before starting the revision test. Your teacher will tell you when to begin.</w:t>
+        <w:t>If you agreed to participate in the research, read this preview when your teacher tells you. If you chose not to participate, skip this page. Do not consult the preview during the test.</w:t>
       </w:r>
     </w:p>
     <w:p>
@@ -372,7 +372,7 @@
     </w:p>
     <w:p>
       <w:r>
-        <w:t>7. Which expression is natural in English?</w:t>
+        <w:t>7. A speaker describes how lonely she felt after moving abroad. Several listeners recognise the same feelings from their own lives and are emotionally moved by the story. Her story ___.</w:t>
       </w:r>
     </w:p>
     <w:p>
@@ -380,7 +380,7 @@
         <w:spacing w:after="20"/>
       </w:pPr>
       <w:r>
-        <w:t>A. struck a chord at</w:t>
+        <w:t>A. kept their traditions alive</w:t>
       </w:r>
     </w:p>
     <w:p>
@@ -388,7 +388,7 @@
         <w:spacing w:after="20"/>
       </w:pPr>
       <w:r>
-        <w:t>B. struck a chord with</w:t>
+        <w:t>B. struck a chord with them</w:t>
       </w:r>
     </w:p>
     <w:p>
@@ -396,7 +396,7 @@
         <w:spacing w:after="20"/>
       </w:pPr>
       <w:r>
-        <w:t>C. struck a chord to</w:t>
+        <w:t>C. forged a new path for them</w:t>
       </w:r>
     </w:p>
     <w:p>
@@ -404,7 +404,7 @@
         <w:spacing w:after="20"/>
       </w:pPr>
       <w:r>
-        <w:t>D. struck a chord on</w:t>
+        <w:t>D. paid tribute to them</w:t>
       </w:r>
     </w:p>
     <w:p>
@@ -412,7 +412,7 @@
         <w:spacing w:after="20"/>
       </w:pPr>
       <w:r>
-        <w:t>E. struck a chord for</w:t>
+        <w:t>E. marked a special occasion</w:t>
       </w:r>
     </w:p>
     <w:p>

</xml_diff>